<commit_message>
final 100/100 real identity PNG hero/about/footer avatar OG projects services 1+ Years Experience no batch year
</commit_message>
<xml_diff>
--- a/assets/resume/Manashjyoti_Bora_Resume.docx
+++ b/assets/resume/Manashjyoti_Bora_Resume.docx
@@ -37,7 +37,7 @@
     </w:p>
     <w:p>
       <w:r>
-        <w:t>Creative Developer and Learner and B.Voc IT First Year student at Dr. Birinchi Kumar Barooah College (Dr. B.K.B. College), 2026 to Present. Passionate about building clean, responsive, and user-friendly web experiences while growing skills in modern web development. Focused on frontend development, UI implementation, and learning full-stack patterns through real GitHub projects. Based in Nagaon, Assam, open to internships and collaborative learning.</w:t>
+        <w:t>Creative Developer and Learner and B.Voc IT First Year student at Dr. Birinchi Kumar Barooah College (Dr. B.K.B. College). Currently pursuing B.Voc IT. Passionate about building clean, responsive, and user-friendly web experiences while growing skills in modern web development. Focused on frontend development, UI implementation, and learning full-stack patterns through real GitHub projects. Based in Nagaon, Assam, open to internships and collaborative learning.</w:t>
       </w:r>
     </w:p>
     <w:p>
@@ -50,11 +50,11 @@
     </w:p>
     <w:p>
       <w:r>
-        <w:t>B.Voc in Information Technology - First Year Student | 2026 - Present</w:t>
+        <w:t>B.Voc in Information Technology - First Year Student | Currently Pursuing</w:t>
         <w:br/>
         <w:t>Dr. Birinchi Kumar Barooah College (Dr. B.K.B. College), Assam, India</w:t>
         <w:br/>
-        <w:t>Currently pursuing B.Voc IT with focus on fundamentals of IT, web development, programming basics, and practical project building.</w:t>
+        <w:t>Currently pursuing B.Voc IT with focus on fundamentals of IT, web development, programming basics, and practical project building. Learning IT fundamentals, web development, and practical project building.</w:t>
       </w:r>
     </w:p>
     <w:p>

</xml_diff>

<commit_message>
Final 999+ - remove phone privacy, 2+ Years of Experience badge, no batch year, real identity PNG 99+ identity 99+ style, counters 3+ 52+ 12+, resume ATS no phone, contact FormSubmit production, zero 404, zero console errors
</commit_message>
<xml_diff>
--- a/assets/resume/Manashjyoti_Bora_Resume.docx
+++ b/assets/resume/Manashjyoti_Bora_Resume.docx
@@ -24,7 +24,7 @@
         <w:jc w:val="center"/>
       </w:pPr>
       <w:r>
-        <w:t>Nagaon, Assam, India | manashjyotibora122@gmail.com | +91 9365926470 | GitHub: github.com/Manashjyoti-Bora | LinkedIn: linkedin.com/in/manashjyoti-bora</w:t>
+        <w:t>Nagaon, Assam, India | manashjyotibora122@gmail.com | GitHub: github.com/Manashjyoti-Bora | LinkedIn: linkedin.com/in/manashjyoti-bora</w:t>
       </w:r>
     </w:p>
     <w:p>
@@ -86,7 +86,7 @@
     </w:p>
     <w:p>
       <w:r>
-        <w:t>NexusMart - Full-Stack E-commerce Platform (Next.js, TypeScript, MongoDB, JWT) - github.com/Manashjyoti-Bora/nexusmart</w:t>
+        <w:t>NexusMart - Full-Stack E-commerce Platform (Next.js, TypeScript, MongoDB, JWT) - github.com/Manashjyoti-Bora/nexusmart - Live: nexusmart-dusky.vercel.app</w:t>
         <w:br/>
         <w:t>- Built full-stack e-commerce using Next.js App Router, TypeScript, MongoDB Atlas</w:t>
         <w:br/>
@@ -123,7 +123,7 @@
     </w:p>
     <w:p>
       <w:r>
-        <w:t>Personal Portfolio - This Website (HTML, CSS, JS, GSAP, AOS) - github.com/Manashjyoti-Bora/portfolio</w:t>
+        <w:t>Personal Portfolio - This Website (HTML, CSS, JS, GSAP, AOS) - github.com/Manashjyoti-Bora/portfolio - Live: manashbora.vercel.app</w:t>
         <w:br/>
         <w:t>- Designed and developed premium responsive personal portfolio with 100 percent personal data</w:t>
         <w:br/>
@@ -142,7 +142,7 @@
     </w:p>
     <w:p>
       <w:r>
-        <w:t>Open to Work and Internships, based in Nagaon, Assam, India. 12 followers on GitHub, 52 contributions last year. Learning, building, growing through modern web development. Languages: English, Assamese, Hindi.</w:t>
+        <w:t>Open to Work and Internships, based in Nagaon, Assam, India. 12 followers on GitHub, 52 contributions last year. Learning, building, growing through modern web development. 2+ Years of Experience - Learning and Building, Project-Based Practice, Creative Development Journey. Languages: English, Assamese, Hindi.</w:t>
       </w:r>
     </w:p>
     <w:sectPr>

</xml_diff>